<commit_message>
Update F2024_Artificial Intelligence Usage Record.docx
</commit_message>
<xml_diff>
--- a/Documents/F2024_Artificial Intelligence Usage Record.docx
+++ b/Documents/F2024_Artificial Intelligence Usage Record.docx
@@ -1,6 +1,6 @@
 
 <file path=word/document.xml><?xml version="1.0" encoding="utf-8"?>
-<w:document xmlns:wpc="http://schemas.microsoft.com/office/word/2010/wordprocessingCanvas" xmlns:cx="http://schemas.microsoft.com/office/drawing/2014/chartex" xmlns:cx1="http://schemas.microsoft.com/office/drawing/2015/9/8/chartex" xmlns:cx2="http://schemas.microsoft.com/office/drawing/2015/10/21/chartex" xmlns:cx3="http://schemas.microsoft.com/office/drawing/2016/5/9/chartex" xmlns:cx4="http://schemas.microsoft.com/office/drawing/2016/5/10/chartex" xmlns:cx5="http://schemas.microsoft.com/office/drawing/2016/5/11/chartex" xmlns:cx6="http://schemas.microsoft.com/office/drawing/2016/5/12/chartex" xmlns:cx7="http://schemas.microsoft.com/office/drawing/2016/5/13/chartex" xmlns:cx8="http://schemas.microsoft.com/office/drawing/2016/5/14/chartex" xmlns:mc="http://schemas.openxmlformats.org/markup-compatibility/2006" xmlns:aink="http://schemas.microsoft.com/office/drawing/2016/ink" xmlns:am3d="http://schemas.microsoft.com/office/drawing/2017/model3d" xmlns:o="urn:schemas-microsoft-com:office:office" xmlns:oel="http://schemas.microsoft.com/office/2019/extlst" xmlns:r="http://schemas.openxmlformats.org/officeDocument/2006/relationships" xmlns:m="http://schemas.openxmlformats.org/officeDocument/2006/math" xmlns:v="urn:schemas-microsoft-com:vml" xmlns:wp14="http://schemas.microsoft.com/office/word/2010/wordprocessingDrawing" xmlns:wp="http://schemas.openxmlformats.org/drawingml/2006/wordprocessingDrawing" xmlns:w10="urn:schemas-microsoft-com:office:word" xmlns:w="http://schemas.openxmlformats.org/wordprocessingml/2006/main" xmlns:w14="http://schemas.microsoft.com/office/word/2010/wordml" xmlns:w15="http://schemas.microsoft.com/office/word/2012/wordml" xmlns:w16cex="http://schemas.microsoft.com/office/word/2018/wordml/cex" xmlns:w16cid="http://schemas.microsoft.com/office/word/2016/wordml/cid" xmlns:w16="http://schemas.microsoft.com/office/word/2018/wordml" xmlns:w16sdtdh="http://schemas.microsoft.com/office/word/2020/wordml/sdtdatahash" xmlns:w16se="http://schemas.microsoft.com/office/word/2015/wordml/symex" xmlns:wpg="http://schemas.microsoft.com/office/word/2010/wordprocessingGroup" xmlns:wpi="http://schemas.microsoft.com/office/word/2010/wordprocessingInk" xmlns:wne="http://schemas.microsoft.com/office/word/2006/wordml" xmlns:wps="http://schemas.microsoft.com/office/word/2010/wordprocessingShape" mc:Ignorable="w14 w15 w16se w16cid w16 w16cex w16sdtdh wp14">
+<w:document xmlns:wpc="http://schemas.microsoft.com/office/word/2010/wordprocessingCanvas" xmlns:cx="http://schemas.microsoft.com/office/drawing/2014/chartex" xmlns:cx1="http://schemas.microsoft.com/office/drawing/2015/9/8/chartex" xmlns:cx2="http://schemas.microsoft.com/office/drawing/2015/10/21/chartex" xmlns:cx3="http://schemas.microsoft.com/office/drawing/2016/5/9/chartex" xmlns:cx4="http://schemas.microsoft.com/office/drawing/2016/5/10/chartex" xmlns:cx5="http://schemas.microsoft.com/office/drawing/2016/5/11/chartex" xmlns:cx6="http://schemas.microsoft.com/office/drawing/2016/5/12/chartex" xmlns:cx7="http://schemas.microsoft.com/office/drawing/2016/5/13/chartex" xmlns:cx8="http://schemas.microsoft.com/office/drawing/2016/5/14/chartex" xmlns:mc="http://schemas.openxmlformats.org/markup-compatibility/2006" xmlns:m="http://schemas.openxmlformats.org/officeDocument/2006/math" xmlns:aink="http://schemas.microsoft.com/office/drawing/2016/ink" xmlns:am3d="http://schemas.microsoft.com/office/drawing/2017/model3d" xmlns:oel="http://schemas.microsoft.com/office/2019/extlst" xmlns:r="http://schemas.openxmlformats.org/officeDocument/2006/relationships" xmlns:wp14="http://schemas.microsoft.com/office/word/2010/wordprocessingDrawing" xmlns:wp="http://schemas.openxmlformats.org/drawingml/2006/wordprocessingDrawing" xmlns:wpg="http://schemas.microsoft.com/office/word/2010/wordprocessingGroup" xmlns:wpi="http://schemas.microsoft.com/office/word/2010/wordprocessingInk" xmlns:wps="http://schemas.microsoft.com/office/word/2010/wordprocessingShape" xmlns:o="urn:schemas-microsoft-com:office:office" xmlns:v="urn:schemas-microsoft-com:vml" xmlns:w10="urn:schemas-microsoft-com:office:word" xmlns:w="http://schemas.openxmlformats.org/wordprocessingml/2006/main" xmlns:w14="http://schemas.microsoft.com/office/word/2010/wordml" xmlns:w15="http://schemas.microsoft.com/office/word/2012/wordml" xmlns:w16cex="http://schemas.microsoft.com/office/word/2018/wordml/cex" xmlns:w16cid="http://schemas.microsoft.com/office/word/2016/wordml/cid" xmlns:w16="http://schemas.microsoft.com/office/word/2018/wordml" xmlns:w16sdtdh="http://schemas.microsoft.com/office/word/2020/wordml/sdtdatahash" xmlns:w16sdtfl="http://schemas.microsoft.com/office/word/2024/wordml/sdtformatlock" xmlns:w16se="http://schemas.microsoft.com/office/word/2015/wordml/symex" xmlns:w16du="http://schemas.microsoft.com/office/word/2023/wordml/word16du" xmlns:wne="http://schemas.microsoft.com/office/word/2006/wordml" mc:Ignorable="w14 w15 w16se w16cid w16 w16cex w16sdtdh w16sdtfl w16du wp14">
   <w:body>
     <w:p>
       <w:pPr>
@@ -106,25 +106,243 @@
           <w:tcPr>
             <w:tcW w:w="2337" w:type="dxa"/>
           </w:tcPr>
-          <w:p/>
+          <w:p>
+            <w:r>
+              <w:t>Jack Yu</w:t>
+            </w:r>
+          </w:p>
         </w:tc>
         <w:tc>
           <w:tcPr>
             <w:tcW w:w="2337" w:type="dxa"/>
           </w:tcPr>
-          <w:p/>
+          <w:p>
+            <w:r>
+              <w:t>Data Model</w:t>
+            </w:r>
+          </w:p>
         </w:tc>
         <w:tc>
           <w:tcPr>
             <w:tcW w:w="2338" w:type="dxa"/>
           </w:tcPr>
+          <w:p>
+            <w:pPr>
+              <w:pStyle w:val="NormalWeb"/>
+              <w:spacing w:before="0" w:beforeAutospacing="0" w:after="0" w:afterAutospacing="0"/>
+              <w:rPr>
+                <w:rFonts w:ascii="Arial" w:hAnsi="Arial" w:cs="Arial"/>
+                <w:color w:val="000000"/>
+                <w:sz w:val="22"/>
+                <w:szCs w:val="22"/>
+              </w:rPr>
+            </w:pPr>
+            <w:r>
+              <w:rPr>
+                <w:rFonts w:ascii="Arial" w:hAnsi="Arial" w:cs="Arial"/>
+                <w:color w:val="000000"/>
+                <w:sz w:val="22"/>
+                <w:szCs w:val="22"/>
+              </w:rPr>
+              <w:t>Provide me a list of the entities that I would be using if I were to create a data model provided this word document</w:t>
+            </w:r>
+          </w:p>
+          <w:p>
+            <w:pPr>
+              <w:pStyle w:val="NormalWeb"/>
+              <w:spacing w:before="0" w:beforeAutospacing="0" w:after="0" w:afterAutospacing="0"/>
+              <w:rPr>
+                <w:rFonts w:ascii="Arial" w:hAnsi="Arial" w:cs="Arial"/>
+                <w:color w:val="000000"/>
+              </w:rPr>
+            </w:pPr>
+          </w:p>
+          <w:p/>
+          <w:p>
+            <w:pPr>
+              <w:pStyle w:val="NormalWeb"/>
+              <w:spacing w:before="0" w:beforeAutospacing="0" w:after="0" w:afterAutospacing="0"/>
+              <w:rPr>
+                <w:rFonts w:ascii="Arial" w:hAnsi="Arial" w:cs="Arial"/>
+                <w:color w:val="000000"/>
+                <w:sz w:val="22"/>
+                <w:szCs w:val="22"/>
+              </w:rPr>
+            </w:pPr>
+            <w:r>
+              <w:rPr>
+                <w:rFonts w:ascii="Arial" w:hAnsi="Arial" w:cs="Arial"/>
+                <w:color w:val="000000"/>
+                <w:sz w:val="22"/>
+                <w:szCs w:val="22"/>
+              </w:rPr>
+              <w:t xml:space="preserve">If an NCR is not re-inspectable and we must create a new NCR number as a result, how do I reflect that in my table? </w:t>
+            </w:r>
+            <w:r>
+              <w:rPr>
+                <w:rFonts w:ascii="Arial" w:hAnsi="Arial" w:cs="Arial"/>
+                <w:color w:val="000000"/>
+                <w:sz w:val="22"/>
+                <w:szCs w:val="22"/>
+              </w:rPr>
+              <w:t xml:space="preserve">(Follow up Question: Would it be considered a </w:t>
+            </w:r>
+            <w:r>
+              <w:rPr>
+                <w:rFonts w:ascii="Arial" w:hAnsi="Arial" w:cs="Arial"/>
+                <w:color w:val="000000"/>
+                <w:sz w:val="22"/>
+                <w:szCs w:val="22"/>
+              </w:rPr>
+              <w:t>one-to-one</w:t>
+            </w:r>
+            <w:r>
+              <w:rPr>
+                <w:rFonts w:ascii="Arial" w:hAnsi="Arial" w:cs="Arial"/>
+                <w:color w:val="000000"/>
+                <w:sz w:val="22"/>
+                <w:szCs w:val="22"/>
+              </w:rPr>
+              <w:t xml:space="preserve"> relationship)</w:t>
+            </w:r>
+            <w:r>
+              <w:rPr>
+                <w:rFonts w:ascii="Arial" w:hAnsi="Arial" w:cs="Arial"/>
+                <w:color w:val="000000"/>
+                <w:sz w:val="22"/>
+                <w:szCs w:val="22"/>
+              </w:rPr>
+              <w:t xml:space="preserve">. </w:t>
+            </w:r>
+          </w:p>
+          <w:p>
+            <w:pPr>
+              <w:pStyle w:val="NormalWeb"/>
+              <w:spacing w:before="0" w:beforeAutospacing="0" w:after="0" w:afterAutospacing="0"/>
+              <w:rPr>
+                <w:rFonts w:ascii="Arial" w:hAnsi="Arial" w:cs="Arial"/>
+                <w:color w:val="000000"/>
+                <w:sz w:val="22"/>
+                <w:szCs w:val="22"/>
+              </w:rPr>
+            </w:pPr>
+          </w:p>
+          <w:p>
+            <w:pPr>
+              <w:pStyle w:val="NormalWeb"/>
+              <w:spacing w:before="0" w:beforeAutospacing="0" w:after="0" w:afterAutospacing="0"/>
+              <w:rPr>
+                <w:rFonts w:ascii="Arial" w:hAnsi="Arial" w:cs="Arial"/>
+                <w:color w:val="000000"/>
+                <w:sz w:val="22"/>
+                <w:szCs w:val="22"/>
+              </w:rPr>
+            </w:pPr>
+          </w:p>
+          <w:p>
+            <w:pPr>
+              <w:pStyle w:val="NormalWeb"/>
+              <w:spacing w:before="0" w:beforeAutospacing="0" w:after="0" w:afterAutospacing="0"/>
+              <w:rPr>
+                <w:rFonts w:ascii="Arial" w:hAnsi="Arial" w:cs="Arial"/>
+                <w:color w:val="000000"/>
+                <w:sz w:val="22"/>
+                <w:szCs w:val="22"/>
+              </w:rPr>
+            </w:pPr>
+          </w:p>
+          <w:p>
+            <w:pPr>
+              <w:pStyle w:val="NormalWeb"/>
+              <w:spacing w:before="0" w:beforeAutospacing="0" w:after="0" w:afterAutospacing="0"/>
+              <w:rPr>
+                <w:rFonts w:ascii="Arial" w:hAnsi="Arial" w:cs="Arial"/>
+                <w:color w:val="000000"/>
+                <w:sz w:val="22"/>
+                <w:szCs w:val="22"/>
+              </w:rPr>
+            </w:pPr>
+          </w:p>
+          <w:p>
+            <w:pPr>
+              <w:pStyle w:val="NormalWeb"/>
+              <w:spacing w:before="0" w:beforeAutospacing="0" w:after="0" w:afterAutospacing="0"/>
+              <w:rPr>
+                <w:rFonts w:ascii="Arial" w:hAnsi="Arial" w:cs="Arial"/>
+                <w:color w:val="000000"/>
+                <w:sz w:val="22"/>
+                <w:szCs w:val="22"/>
+              </w:rPr>
+            </w:pPr>
+          </w:p>
+          <w:p>
+            <w:pPr>
+              <w:pStyle w:val="NormalWeb"/>
+              <w:spacing w:before="0" w:beforeAutospacing="0" w:after="0" w:afterAutospacing="0"/>
+              <w:rPr>
+                <w:rFonts w:ascii="Arial" w:hAnsi="Arial" w:cs="Arial"/>
+                <w:color w:val="000000"/>
+                <w:sz w:val="22"/>
+                <w:szCs w:val="22"/>
+              </w:rPr>
+            </w:pPr>
+            <w:r>
+              <w:rPr>
+                <w:rFonts w:ascii="Arial" w:hAnsi="Arial" w:cs="Arial"/>
+                <w:color w:val="000000"/>
+                <w:sz w:val="22"/>
+                <w:szCs w:val="22"/>
+              </w:rPr>
+              <w:t>What would be appropriate data types for the tables?</w:t>
+            </w:r>
+          </w:p>
+          <w:p/>
+          <w:p/>
+          <w:p/>
+          <w:p/>
+          <w:p/>
+          <w:p/>
+          <w:p>
+            <w:r>
+              <w:t>How should the layout be for it to be as intuitive as possible</w:t>
+            </w:r>
+          </w:p>
           <w:p/>
         </w:tc>
         <w:tc>
           <w:tcPr>
             <w:tcW w:w="2338" w:type="dxa"/>
           </w:tcPr>
-          <w:p/>
+          <w:p>
+            <w:r>
+              <w:t>Using the list of given entities, I used the most appropriate ones to begin developing our data model</w:t>
+            </w:r>
+          </w:p>
+          <w:p/>
+          <w:p/>
+          <w:p/>
+          <w:p>
+            <w:r>
+              <w:t>I didn’t know if the NCR table should be referential or not when a new NCR was recreated in replace of the new one. I also did not know what kind of relationship it would’ve had with the original NCR. I used what it told me to create an appropriate model</w:t>
+            </w:r>
+          </w:p>
+          <w:p/>
+          <w:p/>
+          <w:p>
+            <w:r>
+              <w:t xml:space="preserve">For some of the fields, I wasn’t too sure as to how big the VARCHAR data types should’ve been. I asked Claude to provide suitable data types for the fields. </w:t>
+            </w:r>
+          </w:p>
+          <w:p/>
+          <w:p>
+            <w:r>
+              <w:t xml:space="preserve">The model I ended up finishing was very confusing to look at. I asked Claude to create a layout that would </w:t>
+            </w:r>
+            <w:r>
+              <w:lastRenderedPageBreak/>
+              <w:t>best help the viewer understand what they were viewing. I ended up using the layout they provided.</w:t>
+            </w:r>
+          </w:p>
         </w:tc>
       </w:tr>
       <w:tr>
@@ -244,7 +462,7 @@
 </file>
 
 <file path=word/styles.xml><?xml version="1.0" encoding="utf-8"?>
-<w:styles xmlns:mc="http://schemas.openxmlformats.org/markup-compatibility/2006" xmlns:r="http://schemas.openxmlformats.org/officeDocument/2006/relationships" xmlns:w="http://schemas.openxmlformats.org/wordprocessingml/2006/main" xmlns:w14="http://schemas.microsoft.com/office/word/2010/wordml" xmlns:w15="http://schemas.microsoft.com/office/word/2012/wordml" xmlns:w16cex="http://schemas.microsoft.com/office/word/2018/wordml/cex" xmlns:w16cid="http://schemas.microsoft.com/office/word/2016/wordml/cid" xmlns:w16="http://schemas.microsoft.com/office/word/2018/wordml" xmlns:w16sdtdh="http://schemas.microsoft.com/office/word/2020/wordml/sdtdatahash" xmlns:w16se="http://schemas.microsoft.com/office/word/2015/wordml/symex" mc:Ignorable="w14 w15 w16se w16cid w16 w16cex w16sdtdh">
+<w:styles xmlns:mc="http://schemas.openxmlformats.org/markup-compatibility/2006" xmlns:r="http://schemas.openxmlformats.org/officeDocument/2006/relationships" xmlns:w="http://schemas.openxmlformats.org/wordprocessingml/2006/main" xmlns:w14="http://schemas.microsoft.com/office/word/2010/wordml" xmlns:w15="http://schemas.microsoft.com/office/word/2012/wordml" xmlns:w16cex="http://schemas.microsoft.com/office/word/2018/wordml/cex" xmlns:w16cid="http://schemas.microsoft.com/office/word/2016/wordml/cid" xmlns:w16="http://schemas.microsoft.com/office/word/2018/wordml" xmlns:w16sdtdh="http://schemas.microsoft.com/office/word/2020/wordml/sdtdatahash" xmlns:w16sdtfl="http://schemas.microsoft.com/office/word/2024/wordml/sdtformatlock" xmlns:w16se="http://schemas.microsoft.com/office/word/2015/wordml/symex" xmlns:w16du="http://schemas.microsoft.com/office/word/2023/wordml/word16du" mc:Ignorable="w14 w15 w16se w16cid w16 w16cex w16sdtdh w16sdtfl w16du">
   <w:docDefaults>
     <w:rPrDefault>
       <w:rPr>
@@ -758,6 +976,25 @@
       <w:szCs w:val="32"/>
     </w:rPr>
   </w:style>
+  <w:style w:type="paragraph" w:styleId="NormalWeb">
+    <w:name w:val="Normal (Web)"/>
+    <w:basedOn w:val="Normal"/>
+    <w:uiPriority w:val="99"/>
+    <w:semiHidden/>
+    <w:unhideWhenUsed/>
+    <w:rsid w:val="00AC572B"/>
+    <w:pPr>
+      <w:spacing w:before="100" w:beforeAutospacing="1" w:after="100" w:afterAutospacing="1" w:line="240" w:lineRule="auto"/>
+    </w:pPr>
+    <w:rPr>
+      <w:rFonts w:ascii="Times New Roman" w:eastAsia="Times New Roman" w:hAnsi="Times New Roman" w:cs="Times New Roman"/>
+      <w:kern w:val="0"/>
+      <w:sz w:val="24"/>
+      <w:szCs w:val="24"/>
+      <w:lang w:val="en-CA"/>
+      <w14:ligatures w14:val="none"/>
+    </w:rPr>
+  </w:style>
 </w:styles>
 </file>
 

</xml_diff>